<commit_message>
docs: PRO-SG-009 remise sur la séquence réelle du nettoyage
L'essuyage de l'infuseur n'est pas une opération séparée : le cycle de
nettoyage s'interrompt et réclame le nettoyage manuel. La section suit
désormais le déroulé du site — clé de service, menu de maintenance,
pastille, essuyage au papier absorbant une minute minimum quand la
machine le demande, remise en place jusqu'au clic, reprise du cycle.

Le rinçage à l'eau chaude groupe déposé, prévu par le constructeur,
passe en périodicité à confirmer avec SOVEDIS plutôt que d'être imposé.

Co-Authored-By: Claude Opus 5 <noreply@anthropic.com>
Claude-Session: https://claude.ai/code/session_015f3bXvDt4ZWz22riASrzWJ
</commit_message>
<xml_diff>
--- a/procedure-lyreco/PRO-SG-009_Machine_a_cafe.docx
+++ b/procedure-lyreco/PRO-SG-009_Machine_a_cafe.docx
@@ -752,7 +752,7 @@
           <w:sz w:val="22"/>
           <w:szCs w:val="22"/>
         </w:rPr>
-        <w:t xml:space="preserve">Nettoyage hebdomadaire du groupe café</w:t>
+        <w:t xml:space="preserve">Cycle de nettoyage du groupe café</w:t>
       </w:r>
     </w:p>
     <w:p>
@@ -766,42 +766,27 @@
           <w:sz w:val="18"/>
           <w:szCs w:val="18"/>
         </w:rPr>
-        <w:t xml:space="preserve">Deux opérations complémentaires, à faire chaque semaine : le nettoyage manuel du groupe café (le « brewer ») et le cycle automatique avec pastille.</w:t>
-      </w:r>
-    </w:p>
-    <w:p>
-      <w:pPr>
-        <w:keepNext/>
-        <w:spacing w:after="30" w:before="180"/>
-      </w:pPr>
-      <w:r>
-        <w:rPr>
-          <w:rFonts w:ascii="Arial" w:cs="Arial" w:eastAsia="Arial" w:hAnsi="Arial"/>
-          <w:b/>
-          <w:bCs/>
-          <w:color w:val="0D5C63"/>
-          <w:spacing w:val="25"/>
-          <w:sz w:val="13"/>
-          <w:szCs w:val="13"/>
-        </w:rPr>
-        <w:t xml:space="preserve">ÉTAPE 1</w:t>
-      </w:r>
-    </w:p>
-    <w:p>
-      <w:pPr>
-        <w:keepNext/>
-        <w:spacing w:after="60"/>
-      </w:pPr>
-      <w:r>
-        <w:rPr>
-          <w:rFonts w:ascii="Arial" w:cs="Arial" w:eastAsia="Arial" w:hAnsi="Arial"/>
-          <w:b/>
-          <w:bCs/>
-          <w:color w:val="17232A"/>
-          <w:sz w:val="19"/>
-          <w:szCs w:val="19"/>
-        </w:rPr>
-        <w:t xml:space="preserve">Déposer et rincer le groupe café</w:t>
+        <w:t xml:space="preserve">Le cycle est automatique, mais il s'interrompt en cours de route pour demander le </w:t>
+      </w:r>
+      <w:r>
+        <w:rPr>
+          <w:rFonts w:ascii="Cambria" w:cs="Cambria" w:eastAsia="Cambria" w:hAnsi="Cambria"/>
+          <w:b/>
+          <w:bCs/>
+          <w:color w:val="17232A"/>
+          <w:sz w:val="18"/>
+          <w:szCs w:val="18"/>
+        </w:rPr>
+        <w:t xml:space="preserve">nettoyage manuel de l'infuseur</w:t>
+      </w:r>
+      <w:r>
+        <w:rPr>
+          <w:rFonts w:ascii="Cambria" w:cs="Cambria" w:eastAsia="Cambria" w:hAnsi="Cambria"/>
+          <w:color w:val="17232A"/>
+          <w:sz w:val="18"/>
+          <w:szCs w:val="18"/>
+        </w:rPr>
+        <w:t xml:space="preserve">. Prévoir la clé de service, une pastille de nettoyage, un bac et du papier absorbant avant de commencer.</w:t>
       </w:r>
     </w:p>
     <w:p>
@@ -820,7 +805,27 @@
           <w:sz w:val="18"/>
           <w:szCs w:val="18"/>
         </w:rPr>
-        <w:t xml:space="preserve">Détacher la sortie café du groupe, avec le tuyau et le bec.</w:t>
+        <w:t xml:space="preserve">Récupérer la </w:t>
+      </w:r>
+      <w:r>
+        <w:rPr>
+          <w:rFonts w:ascii="Cambria" w:cs="Cambria" w:eastAsia="Cambria" w:hAnsi="Cambria"/>
+          <w:b/>
+          <w:bCs/>
+          <w:color w:val="17232A"/>
+          <w:sz w:val="18"/>
+          <w:szCs w:val="18"/>
+        </w:rPr>
+        <w:t xml:space="preserve">clé de service</w:t>
+      </w:r>
+      <w:r>
+        <w:rPr>
+          <w:rFonts w:ascii="Cambria" w:cs="Cambria" w:eastAsia="Cambria" w:hAnsi="Cambria"/>
+          <w:color w:val="17232A"/>
+          <w:sz w:val="18"/>
+          <w:szCs w:val="18"/>
+        </w:rPr>
+        <w:t xml:space="preserve"> dans le local ménage.</w:t>
       </w:r>
     </w:p>
     <w:p>
@@ -839,47 +844,27 @@
           <w:sz w:val="18"/>
           <w:szCs w:val="18"/>
         </w:rPr>
-        <w:t xml:space="preserve">Repérer la </w:t>
-      </w:r>
-      <w:r>
-        <w:rPr>
-          <w:rFonts w:ascii="Cambria" w:cs="Cambria" w:eastAsia="Cambria" w:hAnsi="Cambria"/>
-          <w:b/>
-          <w:bCs/>
-          <w:color w:val="17232A"/>
-          <w:sz w:val="18"/>
-          <w:szCs w:val="18"/>
-        </w:rPr>
-        <w:t xml:space="preserve">poignée de fixation</w:t>
-      </w:r>
-      <w:r>
-        <w:rPr>
-          <w:rFonts w:ascii="Cambria" w:cs="Cambria" w:eastAsia="Cambria" w:hAnsi="Cambria"/>
-          <w:color w:val="17232A"/>
-          <w:sz w:val="18"/>
-          <w:szCs w:val="18"/>
-        </w:rPr>
-        <w:t xml:space="preserve"> du groupe, la pousser </w:t>
-      </w:r>
-      <w:r>
-        <w:rPr>
-          <w:rFonts w:ascii="Cambria" w:cs="Cambria" w:eastAsia="Cambria" w:hAnsi="Cambria"/>
-          <w:b/>
-          <w:bCs/>
-          <w:color w:val="17232A"/>
-          <w:sz w:val="18"/>
-          <w:szCs w:val="18"/>
-        </w:rPr>
-        <w:t xml:space="preserve">vers le haut</w:t>
-      </w:r>
-      <w:r>
-        <w:rPr>
-          <w:rFonts w:ascii="Cambria" w:cs="Cambria" w:eastAsia="Cambria" w:hAnsi="Cambria"/>
-          <w:color w:val="17232A"/>
-          <w:sz w:val="18"/>
-          <w:szCs w:val="18"/>
-        </w:rPr>
-        <w:t xml:space="preserve"> et, en la maintenant, tirer puis soulever le groupe hors de la machine.</w:t>
+        <w:t xml:space="preserve">Ouvrir puis refermer la machine : le </w:t>
+      </w:r>
+      <w:r>
+        <w:rPr>
+          <w:rFonts w:ascii="Cambria" w:cs="Cambria" w:eastAsia="Cambria" w:hAnsi="Cambria"/>
+          <w:b/>
+          <w:bCs/>
+          <w:color w:val="17232A"/>
+          <w:sz w:val="18"/>
+          <w:szCs w:val="18"/>
+        </w:rPr>
+        <w:t xml:space="preserve">menu de maintenance</w:t>
+      </w:r>
+      <w:r>
+        <w:rPr>
+          <w:rFonts w:ascii="Cambria" w:cs="Cambria" w:eastAsia="Cambria" w:hAnsi="Cambria"/>
+          <w:color w:val="17232A"/>
+          <w:sz w:val="18"/>
+          <w:szCs w:val="18"/>
+        </w:rPr>
+        <w:t xml:space="preserve"> s'affiche à l'écran.</w:t>
       </w:r>
     </w:p>
     <w:p>
@@ -898,27 +883,27 @@
           <w:sz w:val="18"/>
           <w:szCs w:val="18"/>
         </w:rPr>
-        <w:t xml:space="preserve">Vérifier que le </w:t>
-      </w:r>
-      <w:r>
-        <w:rPr>
-          <w:rFonts w:ascii="Cambria" w:cs="Cambria" w:eastAsia="Cambria" w:hAnsi="Cambria"/>
-          <w:b/>
-          <w:bCs/>
-          <w:color w:val="17232A"/>
-          <w:sz w:val="18"/>
-          <w:szCs w:val="18"/>
-        </w:rPr>
-        <w:t xml:space="preserve">berceau</w:t>
-      </w:r>
-      <w:r>
-        <w:rPr>
-          <w:rFonts w:ascii="Cambria" w:cs="Cambria" w:eastAsia="Cambria" w:hAnsi="Cambria"/>
-          <w:color w:val="17232A"/>
-          <w:sz w:val="18"/>
-          <w:szCs w:val="18"/>
-        </w:rPr>
-        <w:t xml:space="preserve"> du groupe est propre : nettoyer le raccord d'eau et l'accouplement moteur.</w:t>
+        <w:t xml:space="preserve">Placer une </w:t>
+      </w:r>
+      <w:r>
+        <w:rPr>
+          <w:rFonts w:ascii="Cambria" w:cs="Cambria" w:eastAsia="Cambria" w:hAnsi="Cambria"/>
+          <w:b/>
+          <w:bCs/>
+          <w:color w:val="17232A"/>
+          <w:sz w:val="18"/>
+          <w:szCs w:val="18"/>
+        </w:rPr>
+        <w:t xml:space="preserve">pastille de nettoyage</w:t>
+      </w:r>
+      <w:r>
+        <w:rPr>
+          <w:rFonts w:ascii="Cambria" w:cs="Cambria" w:eastAsia="Cambria" w:hAnsi="Cambria"/>
+          <w:color w:val="17232A"/>
+          <w:sz w:val="18"/>
+          <w:szCs w:val="18"/>
+        </w:rPr>
+        <w:t xml:space="preserve"> dans l'infuseur et un bac sous la sortie, puis lancer le nettoyage.</w:t>
       </w:r>
     </w:p>
     <w:p>
@@ -933,31 +918,62 @@
       <w:r>
         <w:rPr>
           <w:rFonts w:ascii="Cambria" w:cs="Cambria" w:eastAsia="Cambria" w:hAnsi="Cambria"/>
-          <w:color w:val="17232A"/>
-          <w:sz w:val="18"/>
-          <w:szCs w:val="18"/>
-        </w:rPr>
-        <w:t xml:space="preserve">Rincer le groupe et les pièces déposées à l'</w:t>
-      </w:r>
-      <w:r>
-        <w:rPr>
-          <w:rFonts w:ascii="Cambria" w:cs="Cambria" w:eastAsia="Cambria" w:hAnsi="Cambria"/>
-          <w:b/>
-          <w:bCs/>
-          <w:color w:val="17232A"/>
-          <w:sz w:val="18"/>
-          <w:szCs w:val="18"/>
-        </w:rPr>
-        <w:t xml:space="preserve">eau chaude claire</w:t>
-      </w:r>
-      <w:r>
-        <w:rPr>
-          <w:rFonts w:ascii="Cambria" w:cs="Cambria" w:eastAsia="Cambria" w:hAnsi="Cambria"/>
-          <w:color w:val="17232A"/>
-          <w:sz w:val="18"/>
-          <w:szCs w:val="18"/>
-        </w:rPr>
-        <w:t xml:space="preserve">. Brosser l'intérieur des tuyaux et les becs de sortie, en insistant dans les angles.</w:t>
+          <w:b/>
+          <w:bCs/>
+          <w:color w:val="17232A"/>
+          <w:sz w:val="18"/>
+          <w:szCs w:val="18"/>
+        </w:rPr>
+        <w:t xml:space="preserve">Quand la machine le demande</w:t>
+      </w:r>
+      <w:r>
+        <w:rPr>
+          <w:rFonts w:ascii="Cambria" w:cs="Cambria" w:eastAsia="Cambria" w:hAnsi="Cambria"/>
+          <w:color w:val="17232A"/>
+          <w:sz w:val="18"/>
+          <w:szCs w:val="18"/>
+        </w:rPr>
+        <w:t xml:space="preserve"> : ouvrir la machine, sortir l'infuseur — la pièce avec le </w:t>
+      </w:r>
+      <w:r>
+        <w:rPr>
+          <w:rFonts w:ascii="Cambria" w:cs="Cambria" w:eastAsia="Cambria" w:hAnsi="Cambria"/>
+          <w:b/>
+          <w:bCs/>
+          <w:color w:val="17232A"/>
+          <w:sz w:val="18"/>
+          <w:szCs w:val="18"/>
+        </w:rPr>
+        <w:t xml:space="preserve">bouton vert</w:t>
+      </w:r>
+      <w:r>
+        <w:rPr>
+          <w:rFonts w:ascii="Cambria" w:cs="Cambria" w:eastAsia="Cambria" w:hAnsi="Cambria"/>
+          <w:color w:val="17232A"/>
+          <w:sz w:val="18"/>
+          <w:szCs w:val="18"/>
+        </w:rPr>
+        <w:t xml:space="preserve"> — et l'essuyer au papier absorbant pendant </w:t>
+      </w:r>
+      <w:r>
+        <w:rPr>
+          <w:rFonts w:ascii="Cambria" w:cs="Cambria" w:eastAsia="Cambria" w:hAnsi="Cambria"/>
+          <w:b/>
+          <w:bCs/>
+          <w:color w:val="17232A"/>
+          <w:sz w:val="18"/>
+          <w:szCs w:val="18"/>
+        </w:rPr>
+        <w:t xml:space="preserve">une minute au minimum</w:t>
+      </w:r>
+      <w:r>
+        <w:rPr>
+          <w:rFonts w:ascii="Cambria" w:cs="Cambria" w:eastAsia="Cambria" w:hAnsi="Cambria"/>
+          <w:color w:val="17232A"/>
+          <w:sz w:val="18"/>
+          <w:szCs w:val="18"/>
+        </w:rPr>
+        <w:t xml:space="preserve">.</w:t>
       </w:r>
     </w:p>
     <w:p>
@@ -976,27 +992,46 @@
           <w:sz w:val="18"/>
           <w:szCs w:val="18"/>
         </w:rPr>
-        <w:t xml:space="preserve">Reposer le groupe sur son berceau et </w:t>
-      </w:r>
-      <w:r>
-        <w:rPr>
-          <w:rFonts w:ascii="Cambria" w:cs="Cambria" w:eastAsia="Cambria" w:hAnsi="Cambria"/>
-          <w:b/>
-          <w:bCs/>
-          <w:color w:val="17232A"/>
-          <w:sz w:val="18"/>
-          <w:szCs w:val="18"/>
-        </w:rPr>
-        <w:t xml:space="preserve">pousser fermement jusqu'au clic</w:t>
-      </w:r>
-      <w:r>
-        <w:rPr>
-          <w:rFonts w:ascii="Cambria" w:cs="Cambria" w:eastAsia="Cambria" w:hAnsi="Cambria"/>
-          <w:color w:val="17232A"/>
-          <w:sz w:val="18"/>
-          <w:szCs w:val="18"/>
-        </w:rPr>
-        <w:t xml:space="preserve">, poignée de fixation en position basse. Remettre la sortie café en l'enfonçant à fond sur les becs.</w:t>
+        <w:t xml:space="preserve">Remettre l'infuseur en place en le poussant </w:t>
+      </w:r>
+      <w:r>
+        <w:rPr>
+          <w:rFonts w:ascii="Cambria" w:cs="Cambria" w:eastAsia="Cambria" w:hAnsi="Cambria"/>
+          <w:b/>
+          <w:bCs/>
+          <w:color w:val="17232A"/>
+          <w:sz w:val="18"/>
+          <w:szCs w:val="18"/>
+        </w:rPr>
+        <w:t xml:space="preserve">jusqu'au clic</w:t>
+      </w:r>
+      <w:r>
+        <w:rPr>
+          <w:rFonts w:ascii="Cambria" w:cs="Cambria" w:eastAsia="Cambria" w:hAnsi="Cambria"/>
+          <w:color w:val="17232A"/>
+          <w:sz w:val="18"/>
+          <w:szCs w:val="18"/>
+        </w:rPr>
+        <w:t xml:space="preserve">, refermer la machine : le cycle se poursuit.</w:t>
+      </w:r>
+    </w:p>
+    <w:p>
+      <w:pPr>
+        <w:pStyle w:val="ListParagraph"/>
+        <w:numPr>
+          <w:ilvl w:val="0"/>
+          <w:numId w:val="2"/>
+        </w:numPr>
+        <w:spacing w:after="38" w:line="240"/>
+      </w:pPr>
+      <w:r>
+        <w:rPr>
+          <w:rFonts w:ascii="Cambria" w:cs="Cambria" w:eastAsia="Cambria" w:hAnsi="Cambria"/>
+          <w:color w:val="17232A"/>
+          <w:sz w:val="18"/>
+          <w:szCs w:val="18"/>
+        </w:rPr>
+        <w:t xml:space="preserve">Retirer la clé de service et vider le bac une fois le cycle terminé.</w:t>
       </w:r>
     </w:p>
     <w:p>
@@ -1045,7 +1080,7 @@
                 <w:sz w:val="13"/>
                 <w:szCs w:val="13"/>
               </w:rPr>
-              <w:t xml:space="preserve">DEUX INTERDITS</w:t>
+              <w:t xml:space="preserve">NE JAMAIS INTERROMPRE LE CYCLE</w:t>
             </w:r>
           </w:p>
           <w:p>
@@ -1055,335 +1090,36 @@
             <w:r>
               <w:rPr>
                 <w:rFonts w:ascii="Cambria" w:cs="Cambria" w:eastAsia="Cambria" w:hAnsi="Cambria"/>
+                <w:color w:val="17232A"/>
+                <w:sz w:val="17"/>
+                <w:szCs w:val="17"/>
+              </w:rPr>
+              <w:t xml:space="preserve">Le cycle complet dure environ </w:t>
+            </w:r>
+            <w:r>
+              <w:rPr>
+                <w:rFonts w:ascii="Cambria" w:cs="Cambria" w:eastAsia="Cambria" w:hAnsi="Cambria"/>
                 <w:b/>
                 <w:bCs/>
                 <w:color w:val="17232A"/>
                 <w:sz w:val="17"/>
                 <w:szCs w:val="17"/>
               </w:rPr>
-              <w:t xml:space="preserve">Ne jamais démonter le groupe café lui-même</w:t>
-            </w:r>
-            <w:r>
-              <w:rPr>
-                <w:rFonts w:ascii="Cambria" w:cs="Cambria" w:eastAsia="Cambria" w:hAnsi="Cambria"/>
-                <w:color w:val="17232A"/>
-                <w:sz w:val="17"/>
-                <w:szCs w:val="17"/>
-              </w:rPr>
-              <w:t xml:space="preserve"> : seule une personne formée peut intervenir dessus. Et </w:t>
-            </w:r>
-            <w:r>
-              <w:rPr>
-                <w:rFonts w:ascii="Cambria" w:cs="Cambria" w:eastAsia="Cambria" w:hAnsi="Cambria"/>
-                <w:b/>
-                <w:bCs/>
-                <w:color w:val="17232A"/>
-                <w:sz w:val="17"/>
-                <w:szCs w:val="17"/>
-              </w:rPr>
-              <w:t xml:space="preserve">jamais de produit moussant ni abrasif</w:t>
-            </w:r>
-            <w:r>
-              <w:rPr>
-                <w:rFonts w:ascii="Cambria" w:cs="Cambria" w:eastAsia="Cambria" w:hAnsi="Cambria"/>
-                <w:color w:val="17232A"/>
-                <w:sz w:val="17"/>
-                <w:szCs w:val="17"/>
-              </w:rPr>
-              <w:t xml:space="preserve"> — eau chaude claire, éventuellement un détergent doux.</w:t>
+              <w:t xml:space="preserve">8 minutes</w:t>
+            </w:r>
+            <w:r>
+              <w:rPr>
+                <w:rFonts w:ascii="Cambria" w:cs="Cambria" w:eastAsia="Cambria" w:hAnsi="Cambria"/>
+                <w:color w:val="17232A"/>
+                <w:sz w:val="17"/>
+                <w:szCs w:val="17"/>
+              </w:rPr>
+              <w:t xml:space="preserve">. S'il est interrompu, la procédure doit être reprise depuis le début. Ne jamais démonter l'infuseur lui-même : seule une personne formée peut intervenir dessus.</w:t>
             </w:r>
           </w:p>
         </w:tc>
       </w:tr>
     </w:tbl>
-    <w:p>
-      <w:pPr>
-        <w:keepNext/>
-        <w:spacing w:after="30" w:before="180"/>
-      </w:pPr>
-      <w:r>
-        <w:rPr>
-          <w:rFonts w:ascii="Arial" w:cs="Arial" w:eastAsia="Arial" w:hAnsi="Arial"/>
-          <w:b/>
-          <w:bCs/>
-          <w:color w:val="0D5C63"/>
-          <w:spacing w:val="25"/>
-          <w:sz w:val="13"/>
-          <w:szCs w:val="13"/>
-        </w:rPr>
-        <w:t xml:space="preserve">ÉTAPE 2</w:t>
-      </w:r>
-    </w:p>
-    <w:p>
-      <w:pPr>
-        <w:keepNext/>
-        <w:spacing w:after="60"/>
-      </w:pPr>
-      <w:r>
-        <w:rPr>
-          <w:rFonts w:ascii="Arial" w:cs="Arial" w:eastAsia="Arial" w:hAnsi="Arial"/>
-          <w:b/>
-          <w:bCs/>
-          <w:color w:val="17232A"/>
-          <w:sz w:val="19"/>
-          <w:szCs w:val="19"/>
-        </w:rPr>
-        <w:t xml:space="preserve">Lancer le cycle de nettoyage avec pastille</w:t>
-      </w:r>
-    </w:p>
-    <w:p>
-      <w:pPr>
-        <w:pStyle w:val="ListParagraph"/>
-        <w:numPr>
-          <w:ilvl w:val="0"/>
-          <w:numId w:val="2"/>
-        </w:numPr>
-        <w:spacing w:after="38" w:line="240"/>
-      </w:pPr>
-      <w:r>
-        <w:rPr>
-          <w:rFonts w:ascii="Cambria" w:cs="Cambria" w:eastAsia="Cambria" w:hAnsi="Cambria"/>
-          <w:color w:val="17232A"/>
-          <w:sz w:val="18"/>
-          <w:szCs w:val="18"/>
-        </w:rPr>
-        <w:t xml:space="preserve">Ouvrir la porte : le </w:t>
-      </w:r>
-      <w:r>
-        <w:rPr>
-          <w:rFonts w:ascii="Cambria" w:cs="Cambria" w:eastAsia="Cambria" w:hAnsi="Cambria"/>
-          <w:b/>
-          <w:bCs/>
-          <w:color w:val="17232A"/>
-          <w:sz w:val="18"/>
-          <w:szCs w:val="18"/>
-        </w:rPr>
-        <w:t xml:space="preserve">menu de service</w:t>
-      </w:r>
-      <w:r>
-        <w:rPr>
-          <w:rFonts w:ascii="Cambria" w:cs="Cambria" w:eastAsia="Cambria" w:hAnsi="Cambria"/>
-          <w:color w:val="17232A"/>
-          <w:sz w:val="18"/>
-          <w:szCs w:val="18"/>
-        </w:rPr>
-        <w:t xml:space="preserve"> s'affiche à l'écran.</w:t>
-      </w:r>
-    </w:p>
-    <w:p>
-      <w:pPr>
-        <w:pStyle w:val="ListParagraph"/>
-        <w:numPr>
-          <w:ilvl w:val="0"/>
-          <w:numId w:val="2"/>
-        </w:numPr>
-        <w:spacing w:after="38" w:line="240"/>
-      </w:pPr>
-      <w:r>
-        <w:rPr>
-          <w:rFonts w:ascii="Cambria" w:cs="Cambria" w:eastAsia="Cambria" w:hAnsi="Cambria"/>
-          <w:color w:val="17232A"/>
-          <w:sz w:val="18"/>
-          <w:szCs w:val="18"/>
-        </w:rPr>
-        <w:t xml:space="preserve">Appuyer sur </w:t>
-      </w:r>
-      <w:r>
-        <w:rPr>
-          <w:rFonts w:ascii="Cambria" w:cs="Cambria" w:eastAsia="Cambria" w:hAnsi="Cambria"/>
-          <w:b/>
-          <w:bCs/>
-          <w:color w:val="17232A"/>
-          <w:sz w:val="18"/>
-          <w:szCs w:val="18"/>
-        </w:rPr>
-        <w:t xml:space="preserve">Nettoyage du groupe café</w:t>
-      </w:r>
-      <w:r>
-        <w:rPr>
-          <w:rFonts w:ascii="Cambria" w:cs="Cambria" w:eastAsia="Cambria" w:hAnsi="Cambria"/>
-          <w:color w:val="17232A"/>
-          <w:sz w:val="18"/>
-          <w:szCs w:val="18"/>
-        </w:rPr>
-        <w:t xml:space="preserve">.</w:t>
-      </w:r>
-    </w:p>
-    <w:p>
-      <w:pPr>
-        <w:pStyle w:val="ListParagraph"/>
-        <w:numPr>
-          <w:ilvl w:val="0"/>
-          <w:numId w:val="2"/>
-        </w:numPr>
-        <w:spacing w:after="38" w:line="240"/>
-      </w:pPr>
-      <w:r>
-        <w:rPr>
-          <w:rFonts w:ascii="Cambria" w:cs="Cambria" w:eastAsia="Cambria" w:hAnsi="Cambria"/>
-          <w:color w:val="17232A"/>
-          <w:sz w:val="18"/>
-          <w:szCs w:val="18"/>
-        </w:rPr>
-        <w:t xml:space="preserve">Placer </w:t>
-      </w:r>
-      <w:r>
-        <w:rPr>
-          <w:rFonts w:ascii="Cambria" w:cs="Cambria" w:eastAsia="Cambria" w:hAnsi="Cambria"/>
-          <w:b/>
-          <w:bCs/>
-          <w:color w:val="17232A"/>
-          <w:sz w:val="18"/>
-          <w:szCs w:val="18"/>
-        </w:rPr>
-        <w:t xml:space="preserve">une pastille de nettoyage</w:t>
-      </w:r>
-      <w:r>
-        <w:rPr>
-          <w:rFonts w:ascii="Cambria" w:cs="Cambria" w:eastAsia="Cambria" w:hAnsi="Cambria"/>
-          <w:color w:val="17232A"/>
-          <w:sz w:val="18"/>
-          <w:szCs w:val="18"/>
-        </w:rPr>
-        <w:t xml:space="preserve"> dans le groupe café, gants et lunettes de protection portés.</w:t>
-      </w:r>
-    </w:p>
-    <w:p>
-      <w:pPr>
-        <w:pStyle w:val="ListParagraph"/>
-        <w:numPr>
-          <w:ilvl w:val="0"/>
-          <w:numId w:val="2"/>
-        </w:numPr>
-        <w:spacing w:after="38" w:line="240"/>
-      </w:pPr>
-      <w:r>
-        <w:rPr>
-          <w:rFonts w:ascii="Cambria" w:cs="Cambria" w:eastAsia="Cambria" w:hAnsi="Cambria"/>
-          <w:color w:val="17232A"/>
-          <w:sz w:val="18"/>
-          <w:szCs w:val="18"/>
-        </w:rPr>
-        <w:t xml:space="preserve">Placer un bac ou un pichet d'un litre sous la sortie.</w:t>
-      </w:r>
-    </w:p>
-    <w:p>
-      <w:pPr>
-        <w:pStyle w:val="ListParagraph"/>
-        <w:numPr>
-          <w:ilvl w:val="0"/>
-          <w:numId w:val="2"/>
-        </w:numPr>
-        <w:spacing w:after="38" w:line="240"/>
-      </w:pPr>
-      <w:r>
-        <w:rPr>
-          <w:rFonts w:ascii="Cambria" w:cs="Cambria" w:eastAsia="Cambria" w:hAnsi="Cambria"/>
-          <w:color w:val="17232A"/>
-          <w:sz w:val="18"/>
-          <w:szCs w:val="18"/>
-        </w:rPr>
-        <w:t xml:space="preserve">Insérer la </w:t>
-      </w:r>
-      <w:r>
-        <w:rPr>
-          <w:rFonts w:ascii="Cambria" w:cs="Cambria" w:eastAsia="Cambria" w:hAnsi="Cambria"/>
-          <w:b/>
-          <w:bCs/>
-          <w:color w:val="17232A"/>
-          <w:sz w:val="18"/>
-          <w:szCs w:val="18"/>
-        </w:rPr>
-        <w:t xml:space="preserve">clé de service</w:t>
-      </w:r>
-      <w:r>
-        <w:rPr>
-          <w:rFonts w:ascii="Cambria" w:cs="Cambria" w:eastAsia="Cambria" w:hAnsi="Cambria"/>
-          <w:color w:val="17232A"/>
-          <w:sz w:val="18"/>
-          <w:szCs w:val="18"/>
-        </w:rPr>
-        <w:t xml:space="preserve"> dans la porte, puis appuyer sur </w:t>
-      </w:r>
-      <w:r>
-        <w:rPr>
-          <w:rFonts w:ascii="Cambria" w:cs="Cambria" w:eastAsia="Cambria" w:hAnsi="Cambria"/>
-          <w:b/>
-          <w:bCs/>
-          <w:color w:val="17232A"/>
-          <w:sz w:val="18"/>
-          <w:szCs w:val="18"/>
-        </w:rPr>
-        <w:t xml:space="preserve">Suivant</w:t>
-      </w:r>
-      <w:r>
-        <w:rPr>
-          <w:rFonts w:ascii="Cambria" w:cs="Cambria" w:eastAsia="Cambria" w:hAnsi="Cambria"/>
-          <w:color w:val="17232A"/>
-          <w:sz w:val="18"/>
-          <w:szCs w:val="18"/>
-        </w:rPr>
-        <w:t xml:space="preserve"> pour lancer le cycle.</w:t>
-      </w:r>
-    </w:p>
-    <w:p>
-      <w:pPr>
-        <w:pStyle w:val="ListParagraph"/>
-        <w:numPr>
-          <w:ilvl w:val="0"/>
-          <w:numId w:val="2"/>
-        </w:numPr>
-        <w:spacing w:after="38" w:line="240"/>
-      </w:pPr>
-      <w:r>
-        <w:rPr>
-          <w:rFonts w:ascii="Cambria" w:cs="Cambria" w:eastAsia="Cambria" w:hAnsi="Cambria"/>
-          <w:color w:val="17232A"/>
-          <w:sz w:val="18"/>
-          <w:szCs w:val="18"/>
-        </w:rPr>
-        <w:t xml:space="preserve">Le cycle dure </w:t>
-      </w:r>
-      <w:r>
-        <w:rPr>
-          <w:rFonts w:ascii="Cambria" w:cs="Cambria" w:eastAsia="Cambria" w:hAnsi="Cambria"/>
-          <w:b/>
-          <w:bCs/>
-          <w:color w:val="17232A"/>
-          <w:sz w:val="18"/>
-          <w:szCs w:val="18"/>
-        </w:rPr>
-        <w:t xml:space="preserve">8 minutes</w:t>
-      </w:r>
-      <w:r>
-        <w:rPr>
-          <w:rFonts w:ascii="Cambria" w:cs="Cambria" w:eastAsia="Cambria" w:hAnsi="Cambria"/>
-          <w:color w:val="17232A"/>
-          <w:sz w:val="18"/>
-          <w:szCs w:val="18"/>
-        </w:rPr>
-        <w:t xml:space="preserve"> : ne jamais l'interrompre. S'il est interrompu, tout reprendre depuis le début.</w:t>
-      </w:r>
-    </w:p>
-    <w:p>
-      <w:pPr>
-        <w:pStyle w:val="ListParagraph"/>
-        <w:numPr>
-          <w:ilvl w:val="0"/>
-          <w:numId w:val="2"/>
-        </w:numPr>
-        <w:spacing w:after="38" w:line="240"/>
-      </w:pPr>
-      <w:r>
-        <w:rPr>
-          <w:rFonts w:ascii="Cambria" w:cs="Cambria" w:eastAsia="Cambria" w:hAnsi="Cambria"/>
-          <w:color w:val="17232A"/>
-          <w:sz w:val="18"/>
-          <w:szCs w:val="18"/>
-        </w:rPr>
-        <w:t xml:space="preserve">Retirer la clé de service, vider le bac.</w:t>
-      </w:r>
-    </w:p>
     <w:p>
       <w:pPr>
         <w:spacing w:after="60"/>
@@ -1394,7 +1130,7 @@
         <w:tblW w:type="dxa" w:w="9864"/>
         <w:tblBorders>
           <w:top w:val="none"/>
-          <w:left w:val="single" w:color="94322B" w:sz="18"/>
+          <w:left w:val="single" w:color="8A5A12" w:sz="18"/>
           <w:bottom w:val="none"/>
           <w:right w:val="none"/>
           <w:insideH w:val="none"/>
@@ -1408,7 +1144,7 @@
         <w:tc>
           <w:tcPr>
             <w:tcW w:type="dxa" w:w="9864"/>
-            <w:shd w:fill="F8E7E4" w:color="auto" w:val="clear"/>
+            <w:shd w:fill="F7EEDE" w:color="auto" w:val="clear"/>
             <w:tcMar>
               <w:top w:type="dxa" w:w="100"/>
               <w:left w:type="dxa" w:w="150"/>
@@ -1425,7 +1161,7 @@
                 <w:rFonts w:ascii="Arial" w:cs="Arial" w:eastAsia="Arial" w:hAnsi="Arial"/>
                 <w:b/>
                 <w:bCs/>
-                <w:color w:val="94322B"/>
+                <w:color w:val="8A5A12"/>
                 <w:spacing w:val="25"/>
                 <w:sz w:val="13"/>
                 <w:szCs w:val="13"/>
@@ -1444,7 +1180,7 @@
                 <w:sz w:val="17"/>
                 <w:szCs w:val="17"/>
               </w:rPr>
-              <w:t xml:space="preserve">Sans nettoyage du groupe café, un message apparaît au bout de </w:t>
+              <w:t xml:space="preserve">Sans nettoyage de l'infuseur, un message apparaît au bout de </w:t>
             </w:r>
             <w:r>
               <w:rPr>
@@ -1682,7 +1418,7 @@
                 <w:sz w:val="17"/>
                 <w:szCs w:val="17"/>
               </w:rPr>
-              <w:t xml:space="preserve">Dépose et rinçage du groupe café</w:t>
+              <w:t xml:space="preserve">Cycle de nettoyage avec pastille et essuyage de l’infuseur</w:t>
             </w:r>
           </w:p>
         </w:tc>
@@ -1738,7 +1474,7 @@
                 <w:sz w:val="17"/>
                 <w:szCs w:val="17"/>
               </w:rPr>
-              <w:t xml:space="preserve">Cycle de nettoyage avec pastille</w:t>
+              <w:t xml:space="preserve">Système de mixage et poubelle du meuble</w:t>
             </w:r>
           </w:p>
         </w:tc>
@@ -1794,7 +1530,7 @@
                 <w:sz w:val="17"/>
                 <w:szCs w:val="17"/>
               </w:rPr>
-              <w:t xml:space="preserve">Système de mixage et poubelle du meuble</w:t>
+              <w:t xml:space="preserve">Rinçage du groupe café à l’eau chaude, groupe déposé — prévu par le constructeur</w:t>
             </w:r>
           </w:p>
         </w:tc>
@@ -1814,14 +1550,16 @@
             </w:pPr>
             <w:r>
               <w:rPr>
-                <w:rFonts w:ascii="Cambria" w:cs="Cambria" w:eastAsia="Cambria" w:hAnsi="Cambria"/>
-                <w:b w:val="false"/>
-                <w:bCs w:val="false"/>
-                <w:color w:val="17232A"/>
-                <w:sz w:val="17"/>
-                <w:szCs w:val="17"/>
-              </w:rPr>
-              <w:t xml:space="preserve">Hebdomadaire</w:t>
+                <w:rFonts w:ascii="Arial" w:cs="Arial" w:eastAsia="Arial" w:hAnsi="Arial"/>
+                <w:i/>
+                <w:iCs/>
+                <w:color w:val="6B4B12"/>
+                <w:sz w:val="16"/>
+                <w:szCs w:val="16"/>
+                <w:highlight w:val="yellow"/>
+                <w:highlightCs w:val="yellow"/>
+              </w:rPr>
+              <w:t xml:space="preserve">à confirmer avec SOVEDIS</w:t>
             </w:r>
           </w:p>
         </w:tc>

</xml_diff>